<commit_message>
docs: update project tech infor
</commit_message>
<xml_diff>
--- a/Week03/Week03_BaoCaoNhom.docx
+++ b/Week03/Week03_BaoCaoNhom.docx
@@ -1,6 +1,6 @@
 
 <file path=word/document.xml><?xml version="1.0" encoding="utf-8"?>
-<w:document xmlns:wpc="http://schemas.microsoft.com/office/word/2010/wordprocessingCanvas" xmlns:cx="http://schemas.microsoft.com/office/drawing/2014/chartex" xmlns:cx1="http://schemas.microsoft.com/office/drawing/2015/9/8/chartex" xmlns:cx2="http://schemas.microsoft.com/office/drawing/2015/10/21/chartex" xmlns:cx3="http://schemas.microsoft.com/office/drawing/2016/5/9/chartex" xmlns:cx4="http://schemas.microsoft.com/office/drawing/2016/5/10/chartex" xmlns:cx5="http://schemas.microsoft.com/office/drawing/2016/5/11/chartex" xmlns:cx6="http://schemas.microsoft.com/office/drawing/2016/5/12/chartex" xmlns:cx7="http://schemas.microsoft.com/office/drawing/2016/5/13/chartex" xmlns:cx8="http://schemas.microsoft.com/office/drawing/2016/5/14/chartex" xmlns:mc="http://schemas.openxmlformats.org/markup-compatibility/2006" xmlns:aink="http://schemas.microsoft.com/office/drawing/2016/ink" xmlns:am3d="http://schemas.microsoft.com/office/drawing/2017/model3d" xmlns:o="urn:schemas-microsoft-com:office:office" xmlns:r="http://schemas.openxmlformats.org/officeDocument/2006/relationships" xmlns:m="http://schemas.openxmlformats.org/officeDocument/2006/math" xmlns:v="urn:schemas-microsoft-com:vml" xmlns:wp14="http://schemas.microsoft.com/office/word/2010/wordprocessingDrawing" xmlns:wp="http://schemas.openxmlformats.org/drawingml/2006/wordprocessingDrawing" xmlns:w10="urn:schemas-microsoft-com:office:word" xmlns:w="http://schemas.openxmlformats.org/wordprocessingml/2006/main" xmlns:w14="http://schemas.microsoft.com/office/word/2010/wordml" xmlns:w15="http://schemas.microsoft.com/office/word/2012/wordml" xmlns:w16cex="http://schemas.microsoft.com/office/word/2018/wordml/cex" xmlns:w16cid="http://schemas.microsoft.com/office/word/2016/wordml/cid" xmlns:w16="http://schemas.microsoft.com/office/word/2018/wordml" xmlns:w16sdtdh="http://schemas.microsoft.com/office/word/2020/wordml/sdtdatahash" xmlns:w16se="http://schemas.microsoft.com/office/word/2015/wordml/symex" xmlns:wpg="http://schemas.microsoft.com/office/word/2010/wordprocessingGroup" xmlns:wpi="http://schemas.microsoft.com/office/word/2010/wordprocessingInk" xmlns:wne="http://schemas.microsoft.com/office/word/2006/wordml" xmlns:wps="http://schemas.microsoft.com/office/word/2010/wordprocessingShape" mc:Ignorable="w14 w15 w16se w16cid w16 w16cex w16sdtdh wp14">
+<w:document xmlns:wpc="http://schemas.microsoft.com/office/word/2010/wordprocessingCanvas" xmlns:cx="http://schemas.microsoft.com/office/drawing/2014/chartex" xmlns:cx1="http://schemas.microsoft.com/office/drawing/2015/9/8/chartex" xmlns:cx2="http://schemas.microsoft.com/office/drawing/2015/10/21/chartex" xmlns:cx3="http://schemas.microsoft.com/office/drawing/2016/5/9/chartex" xmlns:cx4="http://schemas.microsoft.com/office/drawing/2016/5/10/chartex" xmlns:cx5="http://schemas.microsoft.com/office/drawing/2016/5/11/chartex" xmlns:cx6="http://schemas.microsoft.com/office/drawing/2016/5/12/chartex" xmlns:cx7="http://schemas.microsoft.com/office/drawing/2016/5/13/chartex" xmlns:cx8="http://schemas.microsoft.com/office/drawing/2016/5/14/chartex" xmlns:mc="http://schemas.openxmlformats.org/markup-compatibility/2006" xmlns:aink="http://schemas.microsoft.com/office/drawing/2016/ink" xmlns:am3d="http://schemas.microsoft.com/office/drawing/2017/model3d" xmlns:o="urn:schemas-microsoft-com:office:office" xmlns:oel="http://schemas.microsoft.com/office/2019/extlst" xmlns:r="http://schemas.openxmlformats.org/officeDocument/2006/relationships" xmlns:m="http://schemas.openxmlformats.org/officeDocument/2006/math" xmlns:v="urn:schemas-microsoft-com:vml" xmlns:wp14="http://schemas.microsoft.com/office/word/2010/wordprocessingDrawing" xmlns:wp="http://schemas.openxmlformats.org/drawingml/2006/wordprocessingDrawing" xmlns:w10="urn:schemas-microsoft-com:office:word" xmlns:w="http://schemas.openxmlformats.org/wordprocessingml/2006/main" xmlns:w14="http://schemas.microsoft.com/office/word/2010/wordml" xmlns:w15="http://schemas.microsoft.com/office/word/2012/wordml" xmlns:w16cex="http://schemas.microsoft.com/office/word/2018/wordml/cex" xmlns:w16cid="http://schemas.microsoft.com/office/word/2016/wordml/cid" xmlns:w16="http://schemas.microsoft.com/office/word/2018/wordml" xmlns:w16du="http://schemas.microsoft.com/office/word/2023/wordml/word16du" xmlns:w16sdtdh="http://schemas.microsoft.com/office/word/2020/wordml/sdtdatahash" xmlns:w16sdtfl="http://schemas.microsoft.com/office/word/2024/wordml/sdtformatlock" xmlns:w16se="http://schemas.microsoft.com/office/word/2015/wordml/symex" xmlns:wpg="http://schemas.microsoft.com/office/word/2010/wordprocessingGroup" xmlns:wpi="http://schemas.microsoft.com/office/word/2010/wordprocessingInk" xmlns:wne="http://schemas.microsoft.com/office/word/2006/wordml" xmlns:wps="http://schemas.microsoft.com/office/word/2010/wordprocessingShape" mc:Ignorable="w14 w15 w16se w16cid w16 w16cex w16sdtdh w16sdtfl w16du wp14">
   <w:body>
     <w:p>
       <w:pPr>
@@ -123,12 +123,6 @@
         <w:gridCol w:w="6026"/>
       </w:tblGrid>
       <w:tr>
-        <w:tblPrEx>
-          <w:tblCellMar>
-            <w:top w:w="0" w:type="dxa"/>
-            <w:bottom w:w="0" w:type="dxa"/>
-          </w:tblCellMar>
-        </w:tblPrEx>
         <w:tc>
           <w:tcPr>
             <w:tcW w:w="3000" w:type="dxa"/>
@@ -185,12 +179,6 @@
         </w:tc>
       </w:tr>
       <w:tr>
-        <w:tblPrEx>
-          <w:tblCellMar>
-            <w:top w:w="0" w:type="dxa"/>
-            <w:bottom w:w="0" w:type="dxa"/>
-          </w:tblCellMar>
-        </w:tblPrEx>
         <w:tc>
           <w:tcPr>
             <w:tcW w:w="3000" w:type="dxa"/>
@@ -243,12 +231,6 @@
         </w:tc>
       </w:tr>
       <w:tr>
-        <w:tblPrEx>
-          <w:tblCellMar>
-            <w:top w:w="0" w:type="dxa"/>
-            <w:bottom w:w="0" w:type="dxa"/>
-          </w:tblCellMar>
-        </w:tblPrEx>
         <w:tc>
           <w:tcPr>
             <w:tcW w:w="3000" w:type="dxa"/>
@@ -305,12 +287,6 @@
         </w:tc>
       </w:tr>
       <w:tr>
-        <w:tblPrEx>
-          <w:tblCellMar>
-            <w:top w:w="0" w:type="dxa"/>
-            <w:bottom w:w="0" w:type="dxa"/>
-          </w:tblCellMar>
-        </w:tblPrEx>
         <w:tc>
           <w:tcPr>
             <w:tcW w:w="3000" w:type="dxa"/>
@@ -370,12 +346,6 @@
         </w:tc>
       </w:tr>
       <w:tr>
-        <w:tblPrEx>
-          <w:tblCellMar>
-            <w:top w:w="0" w:type="dxa"/>
-            <w:bottom w:w="0" w:type="dxa"/>
-          </w:tblCellMar>
-        </w:tblPrEx>
         <w:tc>
           <w:tcPr>
             <w:tcW w:w="3000" w:type="dxa"/>
@@ -432,12 +402,6 @@
         </w:tc>
       </w:tr>
       <w:tr>
-        <w:tblPrEx>
-          <w:tblCellMar>
-            <w:top w:w="0" w:type="dxa"/>
-            <w:bottom w:w="0" w:type="dxa"/>
-          </w:tblCellMar>
-        </w:tblPrEx>
         <w:tc>
           <w:tcPr>
             <w:tcW w:w="3000" w:type="dxa"/>
@@ -550,12 +514,6 @@
         <w:gridCol w:w="1480"/>
       </w:tblGrid>
       <w:tr>
-        <w:tblPrEx>
-          <w:tblCellMar>
-            <w:top w:w="0" w:type="dxa"/>
-            <w:bottom w:w="0" w:type="dxa"/>
-          </w:tblCellMar>
-        </w:tblPrEx>
         <w:tc>
           <w:tcPr>
             <w:tcW w:w="694" w:type="dxa"/>
@@ -723,12 +681,6 @@
         </w:tc>
       </w:tr>
       <w:tr>
-        <w:tblPrEx>
-          <w:tblCellMar>
-            <w:top w:w="0" w:type="dxa"/>
-            <w:bottom w:w="0" w:type="dxa"/>
-          </w:tblCellMar>
-        </w:tblPrEx>
         <w:tc>
           <w:tcPr>
             <w:tcW w:w="694" w:type="dxa"/>
@@ -868,12 +820,6 @@
         </w:tc>
       </w:tr>
       <w:tr>
-        <w:tblPrEx>
-          <w:tblCellMar>
-            <w:top w:w="0" w:type="dxa"/>
-            <w:bottom w:w="0" w:type="dxa"/>
-          </w:tblCellMar>
-        </w:tblPrEx>
         <w:tc>
           <w:tcPr>
             <w:tcW w:w="694" w:type="dxa"/>
@@ -1007,12 +953,6 @@
         </w:tc>
       </w:tr>
       <w:tr>
-        <w:tblPrEx>
-          <w:tblCellMar>
-            <w:top w:w="0" w:type="dxa"/>
-            <w:bottom w:w="0" w:type="dxa"/>
-          </w:tblCellMar>
-        </w:tblPrEx>
         <w:tc>
           <w:tcPr>
             <w:tcW w:w="694" w:type="dxa"/>
@@ -1146,12 +1086,6 @@
         </w:tc>
       </w:tr>
       <w:tr>
-        <w:tblPrEx>
-          <w:tblCellMar>
-            <w:top w:w="0" w:type="dxa"/>
-            <w:bottom w:w="0" w:type="dxa"/>
-          </w:tblCellMar>
-        </w:tblPrEx>
         <w:tc>
           <w:tcPr>
             <w:tcW w:w="694" w:type="dxa"/>
@@ -1285,12 +1219,6 @@
         </w:tc>
       </w:tr>
       <w:tr>
-        <w:tblPrEx>
-          <w:tblCellMar>
-            <w:top w:w="0" w:type="dxa"/>
-            <w:bottom w:w="0" w:type="dxa"/>
-          </w:tblCellMar>
-        </w:tblPrEx>
         <w:tc>
           <w:tcPr>
             <w:tcW w:w="694" w:type="dxa"/>
@@ -1451,12 +1379,6 @@
         <w:gridCol w:w="4513"/>
       </w:tblGrid>
       <w:tr>
-        <w:tblPrEx>
-          <w:tblCellMar>
-            <w:top w:w="0" w:type="dxa"/>
-            <w:bottom w:w="0" w:type="dxa"/>
-          </w:tblCellMar>
-        </w:tblPrEx>
         <w:tc>
           <w:tcPr>
             <w:tcW w:w="4513" w:type="dxa"/>
@@ -1513,12 +1435,6 @@
         </w:tc>
       </w:tr>
       <w:tr>
-        <w:tblPrEx>
-          <w:tblCellMar>
-            <w:top w:w="0" w:type="dxa"/>
-            <w:bottom w:w="0" w:type="dxa"/>
-          </w:tblCellMar>
-        </w:tblPrEx>
         <w:tc>
           <w:tcPr>
             <w:tcW w:w="4513" w:type="dxa"/>
@@ -1659,12 +1575,6 @@
         <w:gridCol w:w="1400"/>
       </w:tblGrid>
       <w:tr>
-        <w:tblPrEx>
-          <w:tblCellMar>
-            <w:top w:w="0" w:type="dxa"/>
-            <w:bottom w:w="0" w:type="dxa"/>
-          </w:tblCellMar>
-        </w:tblPrEx>
         <w:tc>
           <w:tcPr>
             <w:tcW w:w="400" w:type="dxa"/>
@@ -1799,12 +1709,6 @@
         </w:tc>
       </w:tr>
       <w:tr>
-        <w:tblPrEx>
-          <w:tblCellMar>
-            <w:top w:w="0" w:type="dxa"/>
-            <w:bottom w:w="0" w:type="dxa"/>
-          </w:tblCellMar>
-        </w:tblPrEx>
         <w:tc>
           <w:tcPr>
             <w:tcW w:w="400" w:type="dxa"/>
@@ -1885,12 +1789,10 @@
             </w:pPr>
             <w:r>
               <w:rPr>
-                <w:rFonts w:ascii="Courier New" w:eastAsia="Courier New" w:hAnsi="Courier New" w:cs="Courier New"/>
-                <w:color w:val="2980B9"/>
-                <w:sz w:val="24"/>
-                <w:szCs w:val="24"/>
-              </w:rPr>
-              <w:t>[ ]</w:t>
+                <w:sz w:val="24"/>
+                <w:szCs w:val="24"/>
+              </w:rPr>
+              <w:t>[x]</w:t>
             </w:r>
           </w:p>
         </w:tc>
@@ -1923,12 +1825,6 @@
         </w:tc>
       </w:tr>
       <w:tr>
-        <w:tblPrEx>
-          <w:tblCellMar>
-            <w:top w:w="0" w:type="dxa"/>
-            <w:bottom w:w="0" w:type="dxa"/>
-          </w:tblCellMar>
-        </w:tblPrEx>
         <w:tc>
           <w:tcPr>
             <w:tcW w:w="400" w:type="dxa"/>
@@ -2005,12 +1901,10 @@
             </w:pPr>
             <w:r>
               <w:rPr>
-                <w:rFonts w:ascii="Courier New" w:eastAsia="Courier New" w:hAnsi="Courier New" w:cs="Courier New"/>
-                <w:color w:val="2980B9"/>
-                <w:sz w:val="24"/>
-                <w:szCs w:val="24"/>
-              </w:rPr>
-              <w:t>[ ]</w:t>
+                <w:sz w:val="24"/>
+                <w:szCs w:val="24"/>
+              </w:rPr>
+              <w:t>[x]</w:t>
             </w:r>
           </w:p>
         </w:tc>
@@ -2043,12 +1937,6 @@
         </w:tc>
       </w:tr>
       <w:tr>
-        <w:tblPrEx>
-          <w:tblCellMar>
-            <w:top w:w="0" w:type="dxa"/>
-            <w:bottom w:w="0" w:type="dxa"/>
-          </w:tblCellMar>
-        </w:tblPrEx>
         <w:tc>
           <w:tcPr>
             <w:tcW w:w="400" w:type="dxa"/>
@@ -2125,12 +2013,10 @@
             </w:pPr>
             <w:r>
               <w:rPr>
-                <w:rFonts w:ascii="Courier New" w:eastAsia="Courier New" w:hAnsi="Courier New" w:cs="Courier New"/>
-                <w:color w:val="2980B9"/>
-                <w:sz w:val="24"/>
-                <w:szCs w:val="24"/>
-              </w:rPr>
-              <w:t>[ ]</w:t>
+                <w:sz w:val="24"/>
+                <w:szCs w:val="24"/>
+              </w:rPr>
+              <w:t>[x]</w:t>
             </w:r>
           </w:p>
         </w:tc>
@@ -2163,12 +2049,6 @@
         </w:tc>
       </w:tr>
       <w:tr>
-        <w:tblPrEx>
-          <w:tblCellMar>
-            <w:top w:w="0" w:type="dxa"/>
-            <w:bottom w:w="0" w:type="dxa"/>
-          </w:tblCellMar>
-        </w:tblPrEx>
         <w:tc>
           <w:tcPr>
             <w:tcW w:w="400" w:type="dxa"/>
@@ -2245,12 +2125,10 @@
             </w:pPr>
             <w:r>
               <w:rPr>
-                <w:rFonts w:ascii="Courier New" w:eastAsia="Courier New" w:hAnsi="Courier New" w:cs="Courier New"/>
-                <w:color w:val="2980B9"/>
-                <w:sz w:val="24"/>
-                <w:szCs w:val="24"/>
-              </w:rPr>
-              <w:t>[ ]</w:t>
+                <w:sz w:val="24"/>
+                <w:szCs w:val="24"/>
+              </w:rPr>
+              <w:t>[x]</w:t>
             </w:r>
           </w:p>
         </w:tc>
@@ -2283,12 +2161,6 @@
         </w:tc>
       </w:tr>
       <w:tr>
-        <w:tblPrEx>
-          <w:tblCellMar>
-            <w:top w:w="0" w:type="dxa"/>
-            <w:bottom w:w="0" w:type="dxa"/>
-          </w:tblCellMar>
-        </w:tblPrEx>
         <w:tc>
           <w:tcPr>
             <w:tcW w:w="400" w:type="dxa"/>
@@ -2365,12 +2237,10 @@
             </w:pPr>
             <w:r>
               <w:rPr>
-                <w:rFonts w:ascii="Courier New" w:eastAsia="Courier New" w:hAnsi="Courier New" w:cs="Courier New"/>
-                <w:color w:val="2980B9"/>
-                <w:sz w:val="24"/>
-                <w:szCs w:val="24"/>
-              </w:rPr>
-              <w:t>[ ]</w:t>
+                <w:sz w:val="24"/>
+                <w:szCs w:val="24"/>
+              </w:rPr>
+              <w:t>[x]</w:t>
             </w:r>
           </w:p>
         </w:tc>
@@ -2846,7 +2716,7 @@
           <w:szCs w:val="24"/>
         </w:rPr>
         <w:pict w14:anchorId="0C5777BB">
-          <v:rect id="_x0000_i1026" style="width:0;height:1.5pt" o:hralign="center" o:hrstd="t" o:hr="t" fillcolor="#a0a0a0" stroked="f"/>
+          <v:rect id="_x0000_i1025" style="width:0;height:1.5pt" o:hralign="center" o:hrstd="t" o:hr="t" fillcolor="#a0a0a0" stroked="f"/>
         </w:pict>
       </w:r>
     </w:p>
@@ -3131,12 +3001,6 @@
         <w:gridCol w:w="4560"/>
       </w:tblGrid>
       <w:tr>
-        <w:tblPrEx>
-          <w:tblCellMar>
-            <w:top w:w="0" w:type="dxa"/>
-            <w:bottom w:w="0" w:type="dxa"/>
-          </w:tblCellMar>
-        </w:tblPrEx>
         <w:tc>
           <w:tcPr>
             <w:tcW w:w="4500" w:type="dxa"/>
@@ -3376,12 +3240,6 @@
         <w:gridCol w:w="1193"/>
       </w:tblGrid>
       <w:tr>
-        <w:tblPrEx>
-          <w:tblCellMar>
-            <w:top w:w="0" w:type="dxa"/>
-            <w:bottom w:w="0" w:type="dxa"/>
-          </w:tblCellMar>
-        </w:tblPrEx>
         <w:tc>
           <w:tcPr>
             <w:tcW w:w="381" w:type="dxa"/>
@@ -3550,12 +3408,6 @@
         </w:tc>
       </w:tr>
       <w:tr>
-        <w:tblPrEx>
-          <w:tblCellMar>
-            <w:top w:w="0" w:type="dxa"/>
-            <w:bottom w:w="0" w:type="dxa"/>
-          </w:tblCellMar>
-        </w:tblPrEx>
         <w:tc>
           <w:tcPr>
             <w:tcW w:w="381" w:type="dxa"/>
@@ -3688,12 +3540,6 @@
         </w:tc>
       </w:tr>
       <w:tr>
-        <w:tblPrEx>
-          <w:tblCellMar>
-            <w:top w:w="0" w:type="dxa"/>
-            <w:bottom w:w="0" w:type="dxa"/>
-          </w:tblCellMar>
-        </w:tblPrEx>
         <w:tc>
           <w:tcPr>
             <w:tcW w:w="381" w:type="dxa"/>
@@ -3826,12 +3672,6 @@
         </w:tc>
       </w:tr>
       <w:tr>
-        <w:tblPrEx>
-          <w:tblCellMar>
-            <w:top w:w="0" w:type="dxa"/>
-            <w:bottom w:w="0" w:type="dxa"/>
-          </w:tblCellMar>
-        </w:tblPrEx>
         <w:tc>
           <w:tcPr>
             <w:tcW w:w="381" w:type="dxa"/>
@@ -3964,12 +3804,6 @@
         </w:tc>
       </w:tr>
       <w:tr>
-        <w:tblPrEx>
-          <w:tblCellMar>
-            <w:top w:w="0" w:type="dxa"/>
-            <w:bottom w:w="0" w:type="dxa"/>
-          </w:tblCellMar>
-        </w:tblPrEx>
         <w:tc>
           <w:tcPr>
             <w:tcW w:w="381" w:type="dxa"/>
@@ -4124,12 +3958,6 @@
         </w:tc>
       </w:tr>
       <w:tr>
-        <w:tblPrEx>
-          <w:tblCellMar>
-            <w:top w:w="0" w:type="dxa"/>
-            <w:bottom w:w="0" w:type="dxa"/>
-          </w:tblCellMar>
-        </w:tblPrEx>
         <w:tc>
           <w:tcPr>
             <w:tcW w:w="381" w:type="dxa"/>
@@ -4284,12 +4112,6 @@
         </w:tc>
       </w:tr>
       <w:tr>
-        <w:tblPrEx>
-          <w:tblCellMar>
-            <w:top w:w="0" w:type="dxa"/>
-            <w:bottom w:w="0" w:type="dxa"/>
-          </w:tblCellMar>
-        </w:tblPrEx>
         <w:tc>
           <w:tcPr>
             <w:tcW w:w="381" w:type="dxa"/>
@@ -4446,12 +4268,6 @@
         </w:tc>
       </w:tr>
       <w:tr>
-        <w:tblPrEx>
-          <w:tblCellMar>
-            <w:top w:w="0" w:type="dxa"/>
-            <w:bottom w:w="0" w:type="dxa"/>
-          </w:tblCellMar>
-        </w:tblPrEx>
         <w:tc>
           <w:tcPr>
             <w:tcW w:w="381" w:type="dxa"/>
@@ -4641,12 +4457,6 @@
         <w:gridCol w:w="2000"/>
       </w:tblGrid>
       <w:tr>
-        <w:tblPrEx>
-          <w:tblCellMar>
-            <w:top w:w="0" w:type="dxa"/>
-            <w:bottom w:w="0" w:type="dxa"/>
-          </w:tblCellMar>
-        </w:tblPrEx>
         <w:tc>
           <w:tcPr>
             <w:tcW w:w="400" w:type="dxa"/>
@@ -4814,12 +4624,6 @@
         </w:tc>
       </w:tr>
       <w:tr>
-        <w:tblPrEx>
-          <w:tblCellMar>
-            <w:top w:w="0" w:type="dxa"/>
-            <w:bottom w:w="0" w:type="dxa"/>
-          </w:tblCellMar>
-        </w:tblPrEx>
         <w:tc>
           <w:tcPr>
             <w:tcW w:w="400" w:type="dxa"/>
@@ -5113,12 +4917,6 @@
         </w:tc>
       </w:tr>
       <w:tr>
-        <w:tblPrEx>
-          <w:tblCellMar>
-            <w:top w:w="0" w:type="dxa"/>
-            <w:bottom w:w="0" w:type="dxa"/>
-          </w:tblCellMar>
-        </w:tblPrEx>
         <w:tc>
           <w:tcPr>
             <w:tcW w:w="400" w:type="dxa"/>
@@ -5245,12 +5043,6 @@
         </w:tc>
       </w:tr>
       <w:tr>
-        <w:tblPrEx>
-          <w:tblCellMar>
-            <w:top w:w="0" w:type="dxa"/>
-            <w:bottom w:w="0" w:type="dxa"/>
-          </w:tblCellMar>
-        </w:tblPrEx>
         <w:tc>
           <w:tcPr>
             <w:tcW w:w="400" w:type="dxa"/>
@@ -5491,7 +5283,7 @@
 </file>
 
 <file path=word/endnotes.xml><?xml version="1.0" encoding="utf-8"?>
-<w:endnotes xmlns:wpc="http://schemas.microsoft.com/office/word/2010/wordprocessingCanvas" xmlns:cx="http://schemas.microsoft.com/office/drawing/2014/chartex" xmlns:cx1="http://schemas.microsoft.com/office/drawing/2015/9/8/chartex" xmlns:cx2="http://schemas.microsoft.com/office/drawing/2015/10/21/chartex" xmlns:cx3="http://schemas.microsoft.com/office/drawing/2016/5/9/chartex" xmlns:cx4="http://schemas.microsoft.com/office/drawing/2016/5/10/chartex" xmlns:cx5="http://schemas.microsoft.com/office/drawing/2016/5/11/chartex" xmlns:cx6="http://schemas.microsoft.com/office/drawing/2016/5/12/chartex" xmlns:cx7="http://schemas.microsoft.com/office/drawing/2016/5/13/chartex" xmlns:cx8="http://schemas.microsoft.com/office/drawing/2016/5/14/chartex" xmlns:mc="http://schemas.openxmlformats.org/markup-compatibility/2006" xmlns:aink="http://schemas.microsoft.com/office/drawing/2016/ink" xmlns:am3d="http://schemas.microsoft.com/office/drawing/2017/model3d" xmlns:o="urn:schemas-microsoft-com:office:office" xmlns:r="http://schemas.openxmlformats.org/officeDocument/2006/relationships" xmlns:m="http://schemas.openxmlformats.org/officeDocument/2006/math" xmlns:v="urn:schemas-microsoft-com:vml" xmlns:wp14="http://schemas.microsoft.com/office/word/2010/wordprocessingDrawing" xmlns:wp="http://schemas.openxmlformats.org/drawingml/2006/wordprocessingDrawing" xmlns:w10="urn:schemas-microsoft-com:office:word" xmlns:w="http://schemas.openxmlformats.org/wordprocessingml/2006/main" xmlns:w14="http://schemas.microsoft.com/office/word/2010/wordml" xmlns:w15="http://schemas.microsoft.com/office/word/2012/wordml" xmlns:w16cex="http://schemas.microsoft.com/office/word/2018/wordml/cex" xmlns:w16cid="http://schemas.microsoft.com/office/word/2016/wordml/cid" xmlns:w16="http://schemas.microsoft.com/office/word/2018/wordml" xmlns:w16sdtdh="http://schemas.microsoft.com/office/word/2020/wordml/sdtdatahash" xmlns:w16se="http://schemas.microsoft.com/office/word/2015/wordml/symex" xmlns:wpg="http://schemas.microsoft.com/office/word/2010/wordprocessingGroup" xmlns:wpi="http://schemas.microsoft.com/office/word/2010/wordprocessingInk" xmlns:wne="http://schemas.microsoft.com/office/word/2006/wordml" xmlns:wps="http://schemas.microsoft.com/office/word/2010/wordprocessingShape" mc:Ignorable="w14 w15 w16se w16cid w16 w16cex w16sdtdh wp14">
+<w:endnotes xmlns:wpc="http://schemas.microsoft.com/office/word/2010/wordprocessingCanvas" xmlns:cx="http://schemas.microsoft.com/office/drawing/2014/chartex" xmlns:cx1="http://schemas.microsoft.com/office/drawing/2015/9/8/chartex" xmlns:cx2="http://schemas.microsoft.com/office/drawing/2015/10/21/chartex" xmlns:cx3="http://schemas.microsoft.com/office/drawing/2016/5/9/chartex" xmlns:cx4="http://schemas.microsoft.com/office/drawing/2016/5/10/chartex" xmlns:cx5="http://schemas.microsoft.com/office/drawing/2016/5/11/chartex" xmlns:cx6="http://schemas.microsoft.com/office/drawing/2016/5/12/chartex" xmlns:cx7="http://schemas.microsoft.com/office/drawing/2016/5/13/chartex" xmlns:cx8="http://schemas.microsoft.com/office/drawing/2016/5/14/chartex" xmlns:mc="http://schemas.openxmlformats.org/markup-compatibility/2006" xmlns:aink="http://schemas.microsoft.com/office/drawing/2016/ink" xmlns:am3d="http://schemas.microsoft.com/office/drawing/2017/model3d" xmlns:o="urn:schemas-microsoft-com:office:office" xmlns:oel="http://schemas.microsoft.com/office/2019/extlst" xmlns:r="http://schemas.openxmlformats.org/officeDocument/2006/relationships" xmlns:m="http://schemas.openxmlformats.org/officeDocument/2006/math" xmlns:v="urn:schemas-microsoft-com:vml" xmlns:wp14="http://schemas.microsoft.com/office/word/2010/wordprocessingDrawing" xmlns:wp="http://schemas.openxmlformats.org/drawingml/2006/wordprocessingDrawing" xmlns:w10="urn:schemas-microsoft-com:office:word" xmlns:w="http://schemas.openxmlformats.org/wordprocessingml/2006/main" xmlns:w14="http://schemas.microsoft.com/office/word/2010/wordml" xmlns:w15="http://schemas.microsoft.com/office/word/2012/wordml" xmlns:w16cex="http://schemas.microsoft.com/office/word/2018/wordml/cex" xmlns:w16cid="http://schemas.microsoft.com/office/word/2016/wordml/cid" xmlns:w16="http://schemas.microsoft.com/office/word/2018/wordml" xmlns:w16du="http://schemas.microsoft.com/office/word/2023/wordml/word16du" xmlns:w16sdtdh="http://schemas.microsoft.com/office/word/2020/wordml/sdtdatahash" xmlns:w16sdtfl="http://schemas.microsoft.com/office/word/2024/wordml/sdtformatlock" xmlns:w16se="http://schemas.microsoft.com/office/word/2015/wordml/symex" xmlns:wpg="http://schemas.microsoft.com/office/word/2010/wordprocessingGroup" xmlns:wpi="http://schemas.microsoft.com/office/word/2010/wordprocessingInk" xmlns:wne="http://schemas.microsoft.com/office/word/2006/wordml" xmlns:wps="http://schemas.microsoft.com/office/word/2010/wordprocessingShape" mc:Ignorable="w14 w15 w16se w16cid w16 w16cex w16sdtdh w16sdtfl w16du wp14">
   <w:endnote w:type="separator" w:id="-1">
     <w:p>
       <w:r>
@@ -5510,7 +5302,7 @@
 </file>
 
 <file path=word/footer1.xml><?xml version="1.0" encoding="utf-8"?>
-<w:ftr xmlns:wpc="http://schemas.microsoft.com/office/word/2010/wordprocessingCanvas" xmlns:cx="http://schemas.microsoft.com/office/drawing/2014/chartex" xmlns:cx1="http://schemas.microsoft.com/office/drawing/2015/9/8/chartex" xmlns:cx2="http://schemas.microsoft.com/office/drawing/2015/10/21/chartex" xmlns:cx3="http://schemas.microsoft.com/office/drawing/2016/5/9/chartex" xmlns:cx4="http://schemas.microsoft.com/office/drawing/2016/5/10/chartex" xmlns:cx5="http://schemas.microsoft.com/office/drawing/2016/5/11/chartex" xmlns:cx6="http://schemas.microsoft.com/office/drawing/2016/5/12/chartex" xmlns:cx7="http://schemas.microsoft.com/office/drawing/2016/5/13/chartex" xmlns:cx8="http://schemas.microsoft.com/office/drawing/2016/5/14/chartex" xmlns:mc="http://schemas.openxmlformats.org/markup-compatibility/2006" xmlns:aink="http://schemas.microsoft.com/office/drawing/2016/ink" xmlns:am3d="http://schemas.microsoft.com/office/drawing/2017/model3d" xmlns:o="urn:schemas-microsoft-com:office:office" xmlns:r="http://schemas.openxmlformats.org/officeDocument/2006/relationships" xmlns:m="http://schemas.openxmlformats.org/officeDocument/2006/math" xmlns:v="urn:schemas-microsoft-com:vml" xmlns:wp14="http://schemas.microsoft.com/office/word/2010/wordprocessingDrawing" xmlns:wp="http://schemas.openxmlformats.org/drawingml/2006/wordprocessingDrawing" xmlns:w10="urn:schemas-microsoft-com:office:word" xmlns:w="http://schemas.openxmlformats.org/wordprocessingml/2006/main" xmlns:w14="http://schemas.microsoft.com/office/word/2010/wordml" xmlns:w15="http://schemas.microsoft.com/office/word/2012/wordml" xmlns:w16cex="http://schemas.microsoft.com/office/word/2018/wordml/cex" xmlns:w16cid="http://schemas.microsoft.com/office/word/2016/wordml/cid" xmlns:w16="http://schemas.microsoft.com/office/word/2018/wordml" xmlns:w16sdtdh="http://schemas.microsoft.com/office/word/2020/wordml/sdtdatahash" xmlns:w16se="http://schemas.microsoft.com/office/word/2015/wordml/symex" xmlns:wpg="http://schemas.microsoft.com/office/word/2010/wordprocessingGroup" xmlns:wpi="http://schemas.microsoft.com/office/word/2010/wordprocessingInk" xmlns:wne="http://schemas.microsoft.com/office/word/2006/wordml" xmlns:wps="http://schemas.microsoft.com/office/word/2010/wordprocessingShape" mc:Ignorable="w14 w15 w16se w16cid w16 w16cex w16sdtdh wp14">
+<w:ftr xmlns:wpc="http://schemas.microsoft.com/office/word/2010/wordprocessingCanvas" xmlns:cx="http://schemas.microsoft.com/office/drawing/2014/chartex" xmlns:cx1="http://schemas.microsoft.com/office/drawing/2015/9/8/chartex" xmlns:cx2="http://schemas.microsoft.com/office/drawing/2015/10/21/chartex" xmlns:cx3="http://schemas.microsoft.com/office/drawing/2016/5/9/chartex" xmlns:cx4="http://schemas.microsoft.com/office/drawing/2016/5/10/chartex" xmlns:cx5="http://schemas.microsoft.com/office/drawing/2016/5/11/chartex" xmlns:cx6="http://schemas.microsoft.com/office/drawing/2016/5/12/chartex" xmlns:cx7="http://schemas.microsoft.com/office/drawing/2016/5/13/chartex" xmlns:cx8="http://schemas.microsoft.com/office/drawing/2016/5/14/chartex" xmlns:mc="http://schemas.openxmlformats.org/markup-compatibility/2006" xmlns:aink="http://schemas.microsoft.com/office/drawing/2016/ink" xmlns:am3d="http://schemas.microsoft.com/office/drawing/2017/model3d" xmlns:o="urn:schemas-microsoft-com:office:office" xmlns:oel="http://schemas.microsoft.com/office/2019/extlst" xmlns:r="http://schemas.openxmlformats.org/officeDocument/2006/relationships" xmlns:m="http://schemas.openxmlformats.org/officeDocument/2006/math" xmlns:v="urn:schemas-microsoft-com:vml" xmlns:wp14="http://schemas.microsoft.com/office/word/2010/wordprocessingDrawing" xmlns:wp="http://schemas.openxmlformats.org/drawingml/2006/wordprocessingDrawing" xmlns:w10="urn:schemas-microsoft-com:office:word" xmlns:w="http://schemas.openxmlformats.org/wordprocessingml/2006/main" xmlns:w14="http://schemas.microsoft.com/office/word/2010/wordml" xmlns:w15="http://schemas.microsoft.com/office/word/2012/wordml" xmlns:w16cex="http://schemas.microsoft.com/office/word/2018/wordml/cex" xmlns:w16cid="http://schemas.microsoft.com/office/word/2016/wordml/cid" xmlns:w16="http://schemas.microsoft.com/office/word/2018/wordml" xmlns:w16du="http://schemas.microsoft.com/office/word/2023/wordml/word16du" xmlns:w16sdtdh="http://schemas.microsoft.com/office/word/2020/wordml/sdtdatahash" xmlns:w16sdtfl="http://schemas.microsoft.com/office/word/2024/wordml/sdtformatlock" xmlns:w16se="http://schemas.microsoft.com/office/word/2015/wordml/symex" xmlns:wpg="http://schemas.microsoft.com/office/word/2010/wordprocessingGroup" xmlns:wpi="http://schemas.microsoft.com/office/word/2010/wordprocessingInk" xmlns:wne="http://schemas.microsoft.com/office/word/2006/wordml" xmlns:wps="http://schemas.microsoft.com/office/word/2010/wordprocessingShape" mc:Ignorable="w14 w15 w16se w16cid w16 w16cex w16sdtdh w16sdtfl w16du wp14">
   <w:p>
     <w:pPr>
       <w:jc w:val="center"/>
@@ -5618,7 +5410,7 @@
 </file>
 
 <file path=word/footnotes.xml><?xml version="1.0" encoding="utf-8"?>
-<w:footnotes xmlns:wpc="http://schemas.microsoft.com/office/word/2010/wordprocessingCanvas" xmlns:cx="http://schemas.microsoft.com/office/drawing/2014/chartex" xmlns:cx1="http://schemas.microsoft.com/office/drawing/2015/9/8/chartex" xmlns:cx2="http://schemas.microsoft.com/office/drawing/2015/10/21/chartex" xmlns:cx3="http://schemas.microsoft.com/office/drawing/2016/5/9/chartex" xmlns:cx4="http://schemas.microsoft.com/office/drawing/2016/5/10/chartex" xmlns:cx5="http://schemas.microsoft.com/office/drawing/2016/5/11/chartex" xmlns:cx6="http://schemas.microsoft.com/office/drawing/2016/5/12/chartex" xmlns:cx7="http://schemas.microsoft.com/office/drawing/2016/5/13/chartex" xmlns:cx8="http://schemas.microsoft.com/office/drawing/2016/5/14/chartex" xmlns:mc="http://schemas.openxmlformats.org/markup-compatibility/2006" xmlns:aink="http://schemas.microsoft.com/office/drawing/2016/ink" xmlns:am3d="http://schemas.microsoft.com/office/drawing/2017/model3d" xmlns:o="urn:schemas-microsoft-com:office:office" xmlns:r="http://schemas.openxmlformats.org/officeDocument/2006/relationships" xmlns:m="http://schemas.openxmlformats.org/officeDocument/2006/math" xmlns:v="urn:schemas-microsoft-com:vml" xmlns:wp14="http://schemas.microsoft.com/office/word/2010/wordprocessingDrawing" xmlns:wp="http://schemas.openxmlformats.org/drawingml/2006/wordprocessingDrawing" xmlns:w10="urn:schemas-microsoft-com:office:word" xmlns:w="http://schemas.openxmlformats.org/wordprocessingml/2006/main" xmlns:w14="http://schemas.microsoft.com/office/word/2010/wordml" xmlns:w15="http://schemas.microsoft.com/office/word/2012/wordml" xmlns:w16cex="http://schemas.microsoft.com/office/word/2018/wordml/cex" xmlns:w16cid="http://schemas.microsoft.com/office/word/2016/wordml/cid" xmlns:w16="http://schemas.microsoft.com/office/word/2018/wordml" xmlns:w16sdtdh="http://schemas.microsoft.com/office/word/2020/wordml/sdtdatahash" xmlns:w16se="http://schemas.microsoft.com/office/word/2015/wordml/symex" xmlns:wpg="http://schemas.microsoft.com/office/word/2010/wordprocessingGroup" xmlns:wpi="http://schemas.microsoft.com/office/word/2010/wordprocessingInk" xmlns:wne="http://schemas.microsoft.com/office/word/2006/wordml" xmlns:wps="http://schemas.microsoft.com/office/word/2010/wordprocessingShape" mc:Ignorable="w14 w15 w16se w16cid w16 w16cex w16sdtdh wp14">
+<w:footnotes xmlns:wpc="http://schemas.microsoft.com/office/word/2010/wordprocessingCanvas" xmlns:cx="http://schemas.microsoft.com/office/drawing/2014/chartex" xmlns:cx1="http://schemas.microsoft.com/office/drawing/2015/9/8/chartex" xmlns:cx2="http://schemas.microsoft.com/office/drawing/2015/10/21/chartex" xmlns:cx3="http://schemas.microsoft.com/office/drawing/2016/5/9/chartex" xmlns:cx4="http://schemas.microsoft.com/office/drawing/2016/5/10/chartex" xmlns:cx5="http://schemas.microsoft.com/office/drawing/2016/5/11/chartex" xmlns:cx6="http://schemas.microsoft.com/office/drawing/2016/5/12/chartex" xmlns:cx7="http://schemas.microsoft.com/office/drawing/2016/5/13/chartex" xmlns:cx8="http://schemas.microsoft.com/office/drawing/2016/5/14/chartex" xmlns:mc="http://schemas.openxmlformats.org/markup-compatibility/2006" xmlns:aink="http://schemas.microsoft.com/office/drawing/2016/ink" xmlns:am3d="http://schemas.microsoft.com/office/drawing/2017/model3d" xmlns:o="urn:schemas-microsoft-com:office:office" xmlns:oel="http://schemas.microsoft.com/office/2019/extlst" xmlns:r="http://schemas.openxmlformats.org/officeDocument/2006/relationships" xmlns:m="http://schemas.openxmlformats.org/officeDocument/2006/math" xmlns:v="urn:schemas-microsoft-com:vml" xmlns:wp14="http://schemas.microsoft.com/office/word/2010/wordprocessingDrawing" xmlns:wp="http://schemas.openxmlformats.org/drawingml/2006/wordprocessingDrawing" xmlns:w10="urn:schemas-microsoft-com:office:word" xmlns:w="http://schemas.openxmlformats.org/wordprocessingml/2006/main" xmlns:w14="http://schemas.microsoft.com/office/word/2010/wordml" xmlns:w15="http://schemas.microsoft.com/office/word/2012/wordml" xmlns:w16cex="http://schemas.microsoft.com/office/word/2018/wordml/cex" xmlns:w16cid="http://schemas.microsoft.com/office/word/2016/wordml/cid" xmlns:w16="http://schemas.microsoft.com/office/word/2018/wordml" xmlns:w16du="http://schemas.microsoft.com/office/word/2023/wordml/word16du" xmlns:w16sdtdh="http://schemas.microsoft.com/office/word/2020/wordml/sdtdatahash" xmlns:w16sdtfl="http://schemas.microsoft.com/office/word/2024/wordml/sdtformatlock" xmlns:w16se="http://schemas.microsoft.com/office/word/2015/wordml/symex" xmlns:wpg="http://schemas.microsoft.com/office/word/2010/wordprocessingGroup" xmlns:wpi="http://schemas.microsoft.com/office/word/2010/wordprocessingInk" xmlns:wne="http://schemas.microsoft.com/office/word/2006/wordml" xmlns:wps="http://schemas.microsoft.com/office/word/2010/wordprocessingShape" mc:Ignorable="w14 w15 w16se w16cid w16 w16cex w16sdtdh w16sdtfl w16du wp14">
   <w:footnote w:type="separator" w:id="-1">
     <w:p>
       <w:r>
@@ -5637,7 +5429,7 @@
 </file>
 
 <file path=word/header1.xml><?xml version="1.0" encoding="utf-8"?>
-<w:hdr xmlns:wpc="http://schemas.microsoft.com/office/word/2010/wordprocessingCanvas" xmlns:cx="http://schemas.microsoft.com/office/drawing/2014/chartex" xmlns:cx1="http://schemas.microsoft.com/office/drawing/2015/9/8/chartex" xmlns:cx2="http://schemas.microsoft.com/office/drawing/2015/10/21/chartex" xmlns:cx3="http://schemas.microsoft.com/office/drawing/2016/5/9/chartex" xmlns:cx4="http://schemas.microsoft.com/office/drawing/2016/5/10/chartex" xmlns:cx5="http://schemas.microsoft.com/office/drawing/2016/5/11/chartex" xmlns:cx6="http://schemas.microsoft.com/office/drawing/2016/5/12/chartex" xmlns:cx7="http://schemas.microsoft.com/office/drawing/2016/5/13/chartex" xmlns:cx8="http://schemas.microsoft.com/office/drawing/2016/5/14/chartex" xmlns:mc="http://schemas.openxmlformats.org/markup-compatibility/2006" xmlns:aink="http://schemas.microsoft.com/office/drawing/2016/ink" xmlns:am3d="http://schemas.microsoft.com/office/drawing/2017/model3d" xmlns:o="urn:schemas-microsoft-com:office:office" xmlns:r="http://schemas.openxmlformats.org/officeDocument/2006/relationships" xmlns:m="http://schemas.openxmlformats.org/officeDocument/2006/math" xmlns:v="urn:schemas-microsoft-com:vml" xmlns:wp14="http://schemas.microsoft.com/office/word/2010/wordprocessingDrawing" xmlns:wp="http://schemas.openxmlformats.org/drawingml/2006/wordprocessingDrawing" xmlns:w10="urn:schemas-microsoft-com:office:word" xmlns:w="http://schemas.openxmlformats.org/wordprocessingml/2006/main" xmlns:w14="http://schemas.microsoft.com/office/word/2010/wordml" xmlns:w15="http://schemas.microsoft.com/office/word/2012/wordml" xmlns:w16cex="http://schemas.microsoft.com/office/word/2018/wordml/cex" xmlns:w16cid="http://schemas.microsoft.com/office/word/2016/wordml/cid" xmlns:w16="http://schemas.microsoft.com/office/word/2018/wordml" xmlns:w16sdtdh="http://schemas.microsoft.com/office/word/2020/wordml/sdtdatahash" xmlns:w16se="http://schemas.microsoft.com/office/word/2015/wordml/symex" xmlns:wpg="http://schemas.microsoft.com/office/word/2010/wordprocessingGroup" xmlns:wpi="http://schemas.microsoft.com/office/word/2010/wordprocessingInk" xmlns:wne="http://schemas.microsoft.com/office/word/2006/wordml" xmlns:wps="http://schemas.microsoft.com/office/word/2010/wordprocessingShape" mc:Ignorable="w14 w15 w16se w16cid w16 w16cex w16sdtdh wp14">
+<w:hdr xmlns:wpc="http://schemas.microsoft.com/office/word/2010/wordprocessingCanvas" xmlns:cx="http://schemas.microsoft.com/office/drawing/2014/chartex" xmlns:cx1="http://schemas.microsoft.com/office/drawing/2015/9/8/chartex" xmlns:cx2="http://schemas.microsoft.com/office/drawing/2015/10/21/chartex" xmlns:cx3="http://schemas.microsoft.com/office/drawing/2016/5/9/chartex" xmlns:cx4="http://schemas.microsoft.com/office/drawing/2016/5/10/chartex" xmlns:cx5="http://schemas.microsoft.com/office/drawing/2016/5/11/chartex" xmlns:cx6="http://schemas.microsoft.com/office/drawing/2016/5/12/chartex" xmlns:cx7="http://schemas.microsoft.com/office/drawing/2016/5/13/chartex" xmlns:cx8="http://schemas.microsoft.com/office/drawing/2016/5/14/chartex" xmlns:mc="http://schemas.openxmlformats.org/markup-compatibility/2006" xmlns:aink="http://schemas.microsoft.com/office/drawing/2016/ink" xmlns:am3d="http://schemas.microsoft.com/office/drawing/2017/model3d" xmlns:o="urn:schemas-microsoft-com:office:office" xmlns:oel="http://schemas.microsoft.com/office/2019/extlst" xmlns:r="http://schemas.openxmlformats.org/officeDocument/2006/relationships" xmlns:m="http://schemas.openxmlformats.org/officeDocument/2006/math" xmlns:v="urn:schemas-microsoft-com:vml" xmlns:wp14="http://schemas.microsoft.com/office/word/2010/wordprocessingDrawing" xmlns:wp="http://schemas.openxmlformats.org/drawingml/2006/wordprocessingDrawing" xmlns:w10="urn:schemas-microsoft-com:office:word" xmlns:w="http://schemas.openxmlformats.org/wordprocessingml/2006/main" xmlns:w14="http://schemas.microsoft.com/office/word/2010/wordml" xmlns:w15="http://schemas.microsoft.com/office/word/2012/wordml" xmlns:w16cex="http://schemas.microsoft.com/office/word/2018/wordml/cex" xmlns:w16cid="http://schemas.microsoft.com/office/word/2016/wordml/cid" xmlns:w16="http://schemas.microsoft.com/office/word/2018/wordml" xmlns:w16du="http://schemas.microsoft.com/office/word/2023/wordml/word16du" xmlns:w16sdtdh="http://schemas.microsoft.com/office/word/2020/wordml/sdtdatahash" xmlns:w16sdtfl="http://schemas.microsoft.com/office/word/2024/wordml/sdtformatlock" xmlns:w16se="http://schemas.microsoft.com/office/word/2015/wordml/symex" xmlns:wpg="http://schemas.microsoft.com/office/word/2010/wordprocessingGroup" xmlns:wpi="http://schemas.microsoft.com/office/word/2010/wordprocessingInk" xmlns:wne="http://schemas.microsoft.com/office/word/2006/wordml" xmlns:wps="http://schemas.microsoft.com/office/word/2010/wordprocessingShape" mc:Ignorable="w14 w15 w16se w16cid w16 w16cex w16sdtdh w16sdtfl w16du wp14">
   <w:p>
     <w:pPr>
       <w:pBdr>
@@ -5659,7 +5451,7 @@
 </file>
 
 <file path=word/numbering.xml><?xml version="1.0" encoding="utf-8"?>
-<w:numbering xmlns:wpc="http://schemas.microsoft.com/office/word/2010/wordprocessingCanvas" xmlns:cx="http://schemas.microsoft.com/office/drawing/2014/chartex" xmlns:cx1="http://schemas.microsoft.com/office/drawing/2015/9/8/chartex" xmlns:cx2="http://schemas.microsoft.com/office/drawing/2015/10/21/chartex" xmlns:cx3="http://schemas.microsoft.com/office/drawing/2016/5/9/chartex" xmlns:cx4="http://schemas.microsoft.com/office/drawing/2016/5/10/chartex" xmlns:cx5="http://schemas.microsoft.com/office/drawing/2016/5/11/chartex" xmlns:cx6="http://schemas.microsoft.com/office/drawing/2016/5/12/chartex" xmlns:cx7="http://schemas.microsoft.com/office/drawing/2016/5/13/chartex" xmlns:cx8="http://schemas.microsoft.com/office/drawing/2016/5/14/chartex" xmlns:mc="http://schemas.openxmlformats.org/markup-compatibility/2006" xmlns:aink="http://schemas.microsoft.com/office/drawing/2016/ink" xmlns:am3d="http://schemas.microsoft.com/office/drawing/2017/model3d" xmlns:o="urn:schemas-microsoft-com:office:office" xmlns:r="http://schemas.openxmlformats.org/officeDocument/2006/relationships" xmlns:m="http://schemas.openxmlformats.org/officeDocument/2006/math" xmlns:v="urn:schemas-microsoft-com:vml" xmlns:wp14="http://schemas.microsoft.com/office/word/2010/wordprocessingDrawing" xmlns:wp="http://schemas.openxmlformats.org/drawingml/2006/wordprocessingDrawing" xmlns:w10="urn:schemas-microsoft-com:office:word" xmlns:w="http://schemas.openxmlformats.org/wordprocessingml/2006/main" xmlns:w14="http://schemas.microsoft.com/office/word/2010/wordml" xmlns:w15="http://schemas.microsoft.com/office/word/2012/wordml" xmlns:w16cex="http://schemas.microsoft.com/office/word/2018/wordml/cex" xmlns:w16cid="http://schemas.microsoft.com/office/word/2016/wordml/cid" xmlns:w16="http://schemas.microsoft.com/office/word/2018/wordml" xmlns:w16sdtdh="http://schemas.microsoft.com/office/word/2020/wordml/sdtdatahash" xmlns:w16se="http://schemas.microsoft.com/office/word/2015/wordml/symex" xmlns:wpg="http://schemas.microsoft.com/office/word/2010/wordprocessingGroup" xmlns:wpi="http://schemas.microsoft.com/office/word/2010/wordprocessingInk" xmlns:wne="http://schemas.microsoft.com/office/word/2006/wordml" xmlns:wps="http://schemas.microsoft.com/office/word/2010/wordprocessingShape" mc:Ignorable="w14 w15 w16se w16cid w16 w16cex w16sdtdh wp14">
+<w:numbering xmlns:wpc="http://schemas.microsoft.com/office/word/2010/wordprocessingCanvas" xmlns:cx="http://schemas.microsoft.com/office/drawing/2014/chartex" xmlns:cx1="http://schemas.microsoft.com/office/drawing/2015/9/8/chartex" xmlns:cx2="http://schemas.microsoft.com/office/drawing/2015/10/21/chartex" xmlns:cx3="http://schemas.microsoft.com/office/drawing/2016/5/9/chartex" xmlns:cx4="http://schemas.microsoft.com/office/drawing/2016/5/10/chartex" xmlns:cx5="http://schemas.microsoft.com/office/drawing/2016/5/11/chartex" xmlns:cx6="http://schemas.microsoft.com/office/drawing/2016/5/12/chartex" xmlns:cx7="http://schemas.microsoft.com/office/drawing/2016/5/13/chartex" xmlns:cx8="http://schemas.microsoft.com/office/drawing/2016/5/14/chartex" xmlns:mc="http://schemas.openxmlformats.org/markup-compatibility/2006" xmlns:aink="http://schemas.microsoft.com/office/drawing/2016/ink" xmlns:am3d="http://schemas.microsoft.com/office/drawing/2017/model3d" xmlns:o="urn:schemas-microsoft-com:office:office" xmlns:oel="http://schemas.microsoft.com/office/2019/extlst" xmlns:r="http://schemas.openxmlformats.org/officeDocument/2006/relationships" xmlns:m="http://schemas.openxmlformats.org/officeDocument/2006/math" xmlns:v="urn:schemas-microsoft-com:vml" xmlns:wp14="http://schemas.microsoft.com/office/word/2010/wordprocessingDrawing" xmlns:wp="http://schemas.openxmlformats.org/drawingml/2006/wordprocessingDrawing" xmlns:w10="urn:schemas-microsoft-com:office:word" xmlns:w="http://schemas.openxmlformats.org/wordprocessingml/2006/main" xmlns:w14="http://schemas.microsoft.com/office/word/2010/wordml" xmlns:w15="http://schemas.microsoft.com/office/word/2012/wordml" xmlns:w16cex="http://schemas.microsoft.com/office/word/2018/wordml/cex" xmlns:w16cid="http://schemas.microsoft.com/office/word/2016/wordml/cid" xmlns:w16="http://schemas.microsoft.com/office/word/2018/wordml" xmlns:w16du="http://schemas.microsoft.com/office/word/2023/wordml/word16du" xmlns:w16sdtdh="http://schemas.microsoft.com/office/word/2020/wordml/sdtdatahash" xmlns:w16sdtfl="http://schemas.microsoft.com/office/word/2024/wordml/sdtformatlock" xmlns:w16se="http://schemas.microsoft.com/office/word/2015/wordml/symex" xmlns:wpg="http://schemas.microsoft.com/office/word/2010/wordprocessingGroup" xmlns:wpi="http://schemas.microsoft.com/office/word/2010/wordprocessingInk" xmlns:wne="http://schemas.microsoft.com/office/word/2006/wordml" xmlns:wps="http://schemas.microsoft.com/office/word/2010/wordprocessingShape" mc:Ignorable="w14 w15 w16se w16cid w16 w16cex w16sdtdh w16sdtfl w16du wp14">
   <w:abstractNum w:abstractNumId="0" w15:restartNumberingAfterBreak="0">
     <w:nsid w:val="11313C7F"/>
     <w:multiLevelType w:val="hybridMultilevel"/>
@@ -6301,38 +6093,38 @@
       </w:pPr>
     </w:lvl>
   </w:abstractNum>
-  <w:num w:numId="1">
+  <w:num w:numId="1" w16cid:durableId="1051616002">
     <w:abstractNumId w:val="5"/>
     <w:lvlOverride w:ilvl="0">
       <w:startOverride w:val="1"/>
     </w:lvlOverride>
   </w:num>
-  <w:num w:numId="2">
+  <w:num w:numId="2" w16cid:durableId="596135748">
     <w:abstractNumId w:val="3"/>
     <w:lvlOverride w:ilvl="0">
       <w:startOverride w:val="1"/>
     </w:lvlOverride>
   </w:num>
-  <w:num w:numId="3">
+  <w:num w:numId="3" w16cid:durableId="1710300100">
     <w:abstractNumId w:val="0"/>
     <w:lvlOverride w:ilvl="0">
       <w:startOverride w:val="1"/>
     </w:lvlOverride>
   </w:num>
-  <w:num w:numId="4">
+  <w:num w:numId="4" w16cid:durableId="2083213063">
     <w:abstractNumId w:val="4"/>
   </w:num>
-  <w:num w:numId="5">
+  <w:num w:numId="5" w16cid:durableId="2036077943">
     <w:abstractNumId w:val="1"/>
   </w:num>
-  <w:num w:numId="6">
+  <w:num w:numId="6" w16cid:durableId="1172141754">
     <w:abstractNumId w:val="2"/>
   </w:num>
 </w:numbering>
 </file>
 
 <file path=word/styles.xml><?xml version="1.0" encoding="utf-8"?>
-<w:styles xmlns:mc="http://schemas.openxmlformats.org/markup-compatibility/2006" xmlns:r="http://schemas.openxmlformats.org/officeDocument/2006/relationships" xmlns:w="http://schemas.openxmlformats.org/wordprocessingml/2006/main" xmlns:w14="http://schemas.microsoft.com/office/word/2010/wordml" xmlns:w15="http://schemas.microsoft.com/office/word/2012/wordml" xmlns:w16cex="http://schemas.microsoft.com/office/word/2018/wordml/cex" xmlns:w16cid="http://schemas.microsoft.com/office/word/2016/wordml/cid" xmlns:w16="http://schemas.microsoft.com/office/word/2018/wordml" xmlns:w16sdtdh="http://schemas.microsoft.com/office/word/2020/wordml/sdtdatahash" xmlns:w16se="http://schemas.microsoft.com/office/word/2015/wordml/symex" mc:Ignorable="w14 w15 w16se w16cid w16 w16cex w16sdtdh">
+<w:styles xmlns:mc="http://schemas.openxmlformats.org/markup-compatibility/2006" xmlns:r="http://schemas.openxmlformats.org/officeDocument/2006/relationships" xmlns:w="http://schemas.openxmlformats.org/wordprocessingml/2006/main" xmlns:w14="http://schemas.microsoft.com/office/word/2010/wordml" xmlns:w15="http://schemas.microsoft.com/office/word/2012/wordml" xmlns:w16cex="http://schemas.microsoft.com/office/word/2018/wordml/cex" xmlns:w16cid="http://schemas.microsoft.com/office/word/2016/wordml/cid" xmlns:w16="http://schemas.microsoft.com/office/word/2018/wordml" xmlns:w16du="http://schemas.microsoft.com/office/word/2023/wordml/word16du" xmlns:w16sdtdh="http://schemas.microsoft.com/office/word/2020/wordml/sdtdatahash" xmlns:w16sdtfl="http://schemas.microsoft.com/office/word/2024/wordml/sdtformatlock" xmlns:w16se="http://schemas.microsoft.com/office/word/2015/wordml/symex" mc:Ignorable="w14 w15 w16se w16cid w16 w16cex w16sdtdh w16sdtfl w16du">
   <w:docDefaults>
     <w:rPrDefault>
       <w:rPr>

</xml_diff>